<commit_message>
cleaning the Model part of the system
</commit_message>
<xml_diff>
--- a/project report/Mashaal_Catering_System_Report.docx
+++ b/project report/Mashaal_Catering_System_Report.docx
@@ -215,7 +215,19 @@
         <w:rPr>
           <w:rFonts w:ascii="Calibri" w:hAnsi="Calibri"/>
         </w:rPr>
-        <w:t>The primary purpose of this system is to digitise the end-to-end workflow of a catering business from client event setup and menu selection, through to order placement, payment tracking, and staff-side fulfillment management.</w:t>
+        <w:t xml:space="preserve">The primary purpose of this system is to </w:t>
+      </w:r>
+      <w:r>
+        <w:rPr>
+          <w:rFonts w:ascii="Calibri" w:hAnsi="Calibri"/>
+        </w:rPr>
+        <w:t>digitize</w:t>
+      </w:r>
+      <w:r>
+        <w:rPr>
+          <w:rFonts w:ascii="Calibri" w:hAnsi="Calibri"/>
+        </w:rPr>
+        <w:t xml:space="preserve"> the end-to-end workflow of a catering business from client event setup and menu selection, through to order placement, payment tracking, and staff-side fulfillment management.</w:t>
       </w:r>
     </w:p>
     <w:p>
@@ -645,6 +657,11 @@
     <w:p>
       <w:pPr>
         <w:pStyle w:val="Heading1"/>
+        <w:rPr>
+          <w:rFonts w:ascii="Calibri" w:hAnsi="Calibri"/>
+          <w:color w:val="B48C1E"/>
+          <w:sz w:val="32"/>
+        </w:rPr>
       </w:pPr>
       <w:r>
         <w:rPr>
@@ -653,7 +670,83 @@
           <w:sz w:val="32"/>
         </w:rPr>
         <w:lastRenderedPageBreak/>
-        <w:t>4. Features</w:t>
+        <w:t>4. ER Diagram:</w:t>
+      </w:r>
+    </w:p>
+    <w:p>
+      <w:r>
+        <w:rPr>
+          <w:noProof/>
+        </w:rPr>
+        <w:drawing>
+          <wp:inline distT="0" distB="0" distL="0" distR="0" wp14:anchorId="24704E4C" wp14:editId="7B1684EA">
+            <wp:extent cx="5771515" cy="3912870"/>
+            <wp:effectExtent l="0" t="0" r="635" b="0"/>
+            <wp:docPr id="818669695" name="Picture 1"/>
+            <wp:cNvGraphicFramePr>
+              <a:graphicFrameLocks xmlns:a="http://schemas.openxmlformats.org/drawingml/2006/main" noChangeAspect="1"/>
+            </wp:cNvGraphicFramePr>
+            <a:graphic xmlns:a="http://schemas.openxmlformats.org/drawingml/2006/main">
+              <a:graphicData uri="http://schemas.openxmlformats.org/drawingml/2006/picture">
+                <pic:pic xmlns:pic="http://schemas.openxmlformats.org/drawingml/2006/picture">
+                  <pic:nvPicPr>
+                    <pic:cNvPr id="0" name="Picture 3"/>
+                    <pic:cNvPicPr>
+                      <a:picLocks noChangeAspect="1" noChangeArrowheads="1"/>
+                    </pic:cNvPicPr>
+                  </pic:nvPicPr>
+                  <pic:blipFill>
+                    <a:blip r:embed="rId6">
+                      <a:extLst>
+                        <a:ext uri="{28A0092B-C50C-407E-A947-70E740481C1C}">
+                          <a14:useLocalDpi xmlns:a14="http://schemas.microsoft.com/office/drawing/2010/main" val="0"/>
+                        </a:ext>
+                      </a:extLst>
+                    </a:blip>
+                    <a:srcRect/>
+                    <a:stretch>
+                      <a:fillRect/>
+                    </a:stretch>
+                  </pic:blipFill>
+                  <pic:spPr bwMode="auto">
+                    <a:xfrm>
+                      <a:off x="0" y="0"/>
+                      <a:ext cx="5771515" cy="3912870"/>
+                    </a:xfrm>
+                    <a:prstGeom prst="rect">
+                      <a:avLst/>
+                    </a:prstGeom>
+                    <a:noFill/>
+                    <a:ln>
+                      <a:noFill/>
+                    </a:ln>
+                  </pic:spPr>
+                </pic:pic>
+              </a:graphicData>
+            </a:graphic>
+          </wp:inline>
+        </w:drawing>
+      </w:r>
+    </w:p>
+    <w:p>
+      <w:pPr>
+        <w:pStyle w:val="Heading1"/>
+      </w:pPr>
+      <w:r>
+        <w:rPr>
+          <w:rFonts w:ascii="Calibri" w:hAnsi="Calibri"/>
+          <w:color w:val="B48C1E"/>
+          <w:sz w:val="32"/>
+        </w:rPr>
+        <w:t>5</w:t>
+      </w:r>
+      <w:r>
+        <w:rPr>
+          <w:rFonts w:ascii="Calibri" w:hAnsi="Calibri"/>
+          <w:color w:val="B48C1E"/>
+          <w:sz w:val="32"/>
+        </w:rPr>
+        <w:t>. Features</w:t>
       </w:r>
     </w:p>
     <w:p>
@@ -966,7 +1059,6 @@
           <w:rFonts w:ascii="Calibri" w:hAnsi="Calibri"/>
           <w:color w:val="785F14"/>
         </w:rPr>
-        <w:lastRenderedPageBreak/>
         <w:t>5.1 MVC Flow</w:t>
       </w:r>
     </w:p>
@@ -1571,6 +1663,7 @@
                 <w:b/>
                 <w:sz w:val="20"/>
               </w:rPr>
+              <w:lastRenderedPageBreak/>
               <w:t>Table</w:t>
             </w:r>
           </w:p>
@@ -2216,7 +2309,6 @@
           <w:rFonts w:ascii="Courier New" w:hAnsi="Courier New"/>
           <w:sz w:val="20"/>
         </w:rPr>
-        <w:lastRenderedPageBreak/>
         <w:t>define('DB_HOST', 'localhost');</w:t>
       </w:r>
       <w:r>
@@ -2404,6 +2496,7 @@
           <w:color w:val="B48C1E"/>
           <w:sz w:val="32"/>
         </w:rPr>
+        <w:lastRenderedPageBreak/>
         <w:t>9. Technology Stack</w:t>
       </w:r>
     </w:p>
@@ -2847,7 +2940,6 @@
           <w:color w:val="B48C1E"/>
           <w:sz w:val="32"/>
         </w:rPr>
-        <w:lastRenderedPageBreak/>
         <w:t>11. Conclusion</w:t>
       </w:r>
     </w:p>

</xml_diff>